<commit_message>
Auto sync 2026-10-11 20:21:27
</commit_message>
<xml_diff>
--- a/09-设计与原型/17-订单履约时效管理原型/订单履约时效调整会议纪要.docx
+++ b/09-设计与原型/17-订单履约时效管理原型/订单履约时效调整会议纪要.docx
@@ -2420,7 +2420,7 @@
     <w:qFormat/>
     <w:rsid w:val="00FC693F"/>
     <w:pPr>
-      <w:spacing w:after="120" w:line="324" w:lineRule="auto"/>
+      <w:spacing w:after="100" w:line="307" w:lineRule="auto"/>
     </w:pPr>
     <w:rPr>
       <w:rFonts w:ascii="微软雅黑" w:hAnsi="微软雅黑" w:eastAsia="微软雅黑"/>
@@ -2770,9 +2770,6 @@
     <w:rsid w:val="00FC693F"/>
     <w:pPr>
       <w:keepNext/>
-      <w:pBdr>
-        <w:bottom w:val="single" w:sz="8" w:space="4" w:color="4F81BD" w:themeColor="accent1"/>
-      </w:pBdr>
       <w:spacing w:after="360" w:line="240" w:lineRule="auto" w:before="0"/>
       <w:contextualSpacing/>
     </w:pPr>
@@ -14116,7 +14113,7 @@
     <w:name w:val="正文要点"/>
     <w:basedOn w:val="Normal"/>
     <w:pPr>
-      <w:spacing w:after="80"/>
+      <w:spacing w:after="50"/>
       <w:ind w:left="369" w:hanging="198"/>
     </w:pPr>
   </w:style>

</xml_diff>

<commit_message>
Auto sync 2026-10-11 20:29:43
</commit_message>
<xml_diff>
--- a/09-设计与原型/17-订单履约时效管理原型/订单履约时效调整会议纪要.docx
+++ b/09-设计与原型/17-订单履约时效管理原型/订单履约时效调整会议纪要.docx
@@ -1582,6 +1582,11 @@
       </w:r>
     </w:p>
     <w:p>
+      <w:r>
+        <w:br w:type="page"/>
+      </w:r>
+    </w:p>
+    <w:p>
       <w:pPr>
         <w:pStyle w:val="Heading1"/>
       </w:pPr>

</xml_diff>